<commit_message>
Added image processing to PDF processor
Co-authored-by: Copilot <copilot@github.com>
</commit_message>
<xml_diff>
--- a/src/Indexer/Scripts/example_content_advanced/example_worddocument.docx
+++ b/src/Indexer/Scripts/example_content_advanced/example_worddocument.docx
@@ -335,7 +335,7 @@
                         <w:txbxContent>
                           <w:p>
                             <w:pPr>
-                              <w:pStyle w:val="FrameContentsuser"/>
+                              <w:pStyle w:val="FrameContents"/>
                               <w:bidi w:val="0"/>
                               <w:rPr>
                                 <w:color w:val="000000"/>
@@ -368,7 +368,7 @@
                   <w:txbxContent>
                     <w:p>
                       <w:pPr>
-                        <w:pStyle w:val="FrameContentsuser"/>
+                        <w:pStyle w:val="FrameContents"/>
                         <w:bidi w:val="0"/>
                         <w:rPr>
                           <w:color w:val="000000"/>
@@ -392,7 +392,7 @@
     </w:p>
     <w:p>
       <w:pPr>
-        <w:pStyle w:val="BlockQuotation"/>
+        <w:pStyle w:val="BlockQuotationuser"/>
         <w:bidi w:val="0"/>
         <w:spacing w:lineRule="auto" w:line="276" w:before="0" w:after="140"/>
         <w:ind w:hanging="0" w:start="567" w:end="567"/>
@@ -1143,7 +1143,7 @@
     </w:tbl>
     <w:p>
       <w:pPr>
-        <w:pStyle w:val="BlockQuotation"/>
+        <w:pStyle w:val="BlockQuotationuser"/>
         <w:bidi w:val="0"/>
         <w:spacing w:lineRule="auto" w:line="276" w:before="0" w:after="140"/>
         <w:ind w:hanging="0" w:start="0" w:end="567"/>
@@ -1343,6 +1343,243 @@
         <w:rPr>
           <w:lang w:val="de-DE"/>
         </w:rPr>
+        <w:t>Section 3: Example image</w:t>
+      </w:r>
+    </w:p>
+    <w:p>
+      <w:pPr>
+        <w:pStyle w:val="BodyText"/>
+        <w:bidi w:val="0"/>
+        <w:spacing w:lineRule="auto" w:line="276" w:before="0" w:after="140"/>
+        <w:ind w:hanging="0" w:start="0" w:end="0"/>
+        <w:jc w:val="start"/>
+        <w:rPr>
+          <w:lang w:val="de-DE"/>
+        </w:rPr>
+      </w:pPr>
+      <w:r>
+        <w:rPr>
+          <w:lang w:val="de-DE"/>
+        </w:rPr>
+      </w:r>
+      <w:r>
+        <mc:AlternateContent>
+          <mc:Choice Requires="wps">
+            <w:drawing>
+              <wp:anchor distT="0" distB="0" distL="0" distR="0" simplePos="0" relativeHeight="4" behindDoc="0" locked="0" layoutInCell="0" allowOverlap="1">
+                <wp:simplePos x="0" y="0"/>
+                <wp:positionH relativeFrom="column">
+                  <wp:align>center</wp:align>
+                </wp:positionH>
+                <wp:positionV relativeFrom="paragraph">
+                  <wp:posOffset>635</wp:posOffset>
+                </wp:positionV>
+                <wp:extent cx="6047105" cy="3241675"/>
+                <wp:effectExtent l="0" t="0" r="0" b="0"/>
+                <wp:wrapSquare wrapText="largest"/>
+                <wp:docPr id="2" name="Frame2"/>
+                <a:graphic xmlns:a="http://schemas.openxmlformats.org/drawingml/2006/main">
+                  <a:graphicData uri="http://schemas.microsoft.com/office/word/2010/wordprocessingShape">
+                    <wps:wsp>
+                      <wps:cNvSpPr txBox="1"/>
+                      <wps:spPr>
+                        <a:xfrm>
+                          <a:off x="0" y="0"/>
+                          <a:ext cx="6047105" cy="3241675"/>
+                        </a:xfrm>
+                        <a:prstGeom prst="rect"/>
+                        <a:solidFill>
+                          <a:srgbClr val="FFFFFF"/>
+                        </a:solidFill>
+                      </wps:spPr>
+                      <wps:txbx>
+                        <w:txbxContent>
+                          <w:p>
+                            <w:pPr>
+                              <w:pStyle w:val="Figure"/>
+                              <w:spacing w:before="120" w:after="120"/>
+                              <w:rPr/>
+                            </w:pPr>
+                            <w:r>
+                              <w:rPr/>
+                              <w:drawing>
+                                <wp:inline distT="0" distB="0" distL="0" distR="0">
+                                  <wp:extent cx="6047105" cy="2914015"/>
+                                  <wp:effectExtent l="0" t="0" r="0" b="0"/>
+                                  <wp:docPr id="3" name="Image1"/>
+                                  <wp:cNvGraphicFramePr>
+                                    <a:graphicFrameLocks xmlns:a="http://schemas.openxmlformats.org/drawingml/2006/main" noChangeAspect="1"/>
+                                  </wp:cNvGraphicFramePr>
+                                  <a:graphic xmlns:a="http://schemas.openxmlformats.org/drawingml/2006/main">
+                                    <a:graphicData uri="http://schemas.openxmlformats.org/drawingml/2006/picture">
+                                      <pic:pic xmlns:pic="http://schemas.openxmlformats.org/drawingml/2006/picture">
+                                        <pic:nvPicPr>
+                                          <pic:cNvPr id="3" name="Image1"/>
+                                          <pic:cNvPicPr>
+                                            <a:picLocks noChangeAspect="1" noChangeArrowheads="1"/>
+                                          </pic:cNvPicPr>
+                                        </pic:nvPicPr>
+                                        <pic:blipFill>
+                                          <a:blip r:embed="rId2"/>
+                                          <a:stretch>
+                                            <a:fillRect/>
+                                          </a:stretch>
+                                        </pic:blipFill>
+                                        <pic:spPr bwMode="auto">
+                                          <a:xfrm>
+                                            <a:off x="0" y="0"/>
+                                            <a:ext cx="6047105" cy="2914015"/>
+                                          </a:xfrm>
+                                          <a:prstGeom prst="rect">
+                                            <a:avLst/>
+                                          </a:prstGeom>
+                                          <a:noFill/>
+                                        </pic:spPr>
+                                      </pic:pic>
+                                    </a:graphicData>
+                                  </a:graphic>
+                                </wp:inline>
+                              </w:drawing>
+                              <w:t xml:space="preserve">Figure </w:t>
+                            </w:r>
+                            <w:r>
+                              <w:rPr/>
+                              <w:fldChar w:fldCharType="begin"/>
+                            </w:r>
+                            <w:r>
+                              <w:rPr/>
+                              <w:instrText xml:space="preserve"> SEQ Figure \* ARABIC </w:instrText>
+                            </w:r>
+                            <w:r>
+                              <w:rPr/>
+                              <w:fldChar w:fldCharType="separate"/>
+                            </w:r>
+                            <w:r>
+                              <w:rPr/>
+                              <w:t>1</w:t>
+                            </w:r>
+                            <w:r>
+                              <w:rPr/>
+                              <w:fldChar w:fldCharType="end"/>
+                            </w:r>
+                            <w:r>
+                              <w:rPr/>
+                              <w:t>: Test caption</w:t>
+                            </w:r>
+                          </w:p>
+                        </w:txbxContent>
+                      </wps:txbx>
+                      <wps:bodyPr anchor="t" lIns="0" tIns="0" rIns="0" bIns="0">
+                        <a:noAutofit/>
+                      </wps:bodyPr>
+                    </wps:wsp>
+                  </a:graphicData>
+                </a:graphic>
+              </wp:anchor>
+            </w:drawing>
+          </mc:Choice>
+          <mc:Fallback>
+            <w:pict>
+              <v:rect style="position:absolute;rotation:-0;width:476.15pt;height:255.25pt;mso-wrap-distance-left:0pt;mso-wrap-distance-right:0pt;mso-wrap-distance-top:0pt;mso-wrap-distance-bottom:0pt;margin-top:0pt;mso-position-vertical:top;mso-position-vertical-relative:text;margin-left:11.25pt;mso-position-horizontal:center;mso-position-horizontal-relative:text">
+                <v:textbox inset="0in,0in,0in,0in">
+                  <w:txbxContent>
+                    <w:p>
+                      <w:pPr>
+                        <w:pStyle w:val="Figure"/>
+                        <w:spacing w:before="120" w:after="120"/>
+                        <w:rPr/>
+                      </w:pPr>
+                      <w:r>
+                        <w:rPr/>
+                        <w:drawing>
+                          <wp:inline distT="0" distB="0" distL="0" distR="0">
+                            <wp:extent cx="6047105" cy="2914015"/>
+                            <wp:effectExtent l="0" t="0" r="0" b="0"/>
+                            <wp:docPr id="4" name="Image1"/>
+                            <wp:cNvGraphicFramePr>
+                              <a:graphicFrameLocks xmlns:a="http://schemas.openxmlformats.org/drawingml/2006/main" noChangeAspect="1"/>
+                            </wp:cNvGraphicFramePr>
+                            <a:graphic xmlns:a="http://schemas.openxmlformats.org/drawingml/2006/main">
+                              <a:graphicData uri="http://schemas.openxmlformats.org/drawingml/2006/picture">
+                                <pic:pic xmlns:pic="http://schemas.openxmlformats.org/drawingml/2006/picture">
+                                  <pic:nvPicPr>
+                                    <pic:cNvPr id="4" name="Image1"/>
+                                    <pic:cNvPicPr>
+                                      <a:picLocks noChangeAspect="1" noChangeArrowheads="1"/>
+                                    </pic:cNvPicPr>
+                                  </pic:nvPicPr>
+                                  <pic:blipFill>
+                                    <a:blip r:embed="rId3"/>
+                                    <a:stretch>
+                                      <a:fillRect/>
+                                    </a:stretch>
+                                  </pic:blipFill>
+                                  <pic:spPr bwMode="auto">
+                                    <a:xfrm>
+                                      <a:off x="0" y="0"/>
+                                      <a:ext cx="6047105" cy="2914015"/>
+                                    </a:xfrm>
+                                    <a:prstGeom prst="rect">
+                                      <a:avLst/>
+                                    </a:prstGeom>
+                                    <a:noFill/>
+                                  </pic:spPr>
+                                </pic:pic>
+                              </a:graphicData>
+                            </a:graphic>
+                          </wp:inline>
+                        </w:drawing>
+                        <w:t xml:space="preserve">Figure </w:t>
+                      </w:r>
+                      <w:r>
+                        <w:rPr/>
+                        <w:fldChar w:fldCharType="begin"/>
+                      </w:r>
+                      <w:r>
+                        <w:rPr/>
+                        <w:instrText xml:space="preserve"> SEQ Figure \* ARABIC </w:instrText>
+                      </w:r>
+                      <w:r>
+                        <w:rPr/>
+                        <w:fldChar w:fldCharType="separate"/>
+                      </w:r>
+                      <w:r>
+                        <w:rPr/>
+                        <w:t>1</w:t>
+                      </w:r>
+                      <w:r>
+                        <w:rPr/>
+                        <w:fldChar w:fldCharType="end"/>
+                      </w:r>
+                      <w:r>
+                        <w:rPr/>
+                        <w:t>: Test caption</w:t>
+                      </w:r>
+                    </w:p>
+                  </w:txbxContent>
+                </v:textbox>
+                <w10:wrap type="square" side="largest"/>
+              </v:rect>
+            </w:pict>
+          </mc:Fallback>
+        </mc:AlternateContent>
+      </w:r>
+    </w:p>
+    <w:p>
+      <w:pPr>
+        <w:pStyle w:val="Heading2"/>
+        <w:bidi w:val="0"/>
+        <w:spacing w:lineRule="auto" w:line="276" w:before="0" w:after="140"/>
+        <w:ind w:hanging="0" w:start="0" w:end="0"/>
+        <w:jc w:val="start"/>
+        <w:rPr>
+          <w:lang w:val="de-DE"/>
+        </w:rPr>
+      </w:pPr>
+      <w:r>
+        <w:rPr>
+          <w:lang w:val="de-DE"/>
+        </w:rPr>
         <w:t>Conclusion</w:t>
       </w:r>
     </w:p>
@@ -1365,12 +1602,12 @@
       </w:r>
     </w:p>
     <w:sectPr>
-      <w:headerReference w:type="even" r:id="rId2"/>
-      <w:headerReference w:type="default" r:id="rId3"/>
-      <w:headerReference w:type="first" r:id="rId4"/>
-      <w:footerReference w:type="even" r:id="rId5"/>
-      <w:footerReference w:type="default" r:id="rId6"/>
-      <w:footerReference w:type="first" r:id="rId7"/>
+      <w:headerReference w:type="even" r:id="rId4"/>
+      <w:headerReference w:type="default" r:id="rId5"/>
+      <w:headerReference w:type="first" r:id="rId6"/>
+      <w:footerReference w:type="even" r:id="rId7"/>
+      <w:footerReference w:type="default" r:id="rId8"/>
+      <w:footerReference w:type="first" r:id="rId9"/>
       <w:type w:val="nextPage"/>
       <w:pgSz w:w="12240" w:h="15840"/>
       <w:pgMar w:left="1134" w:right="1134" w:gutter="0" w:header="1134" w:top="1693" w:footer="1134" w:bottom="1693"/>
@@ -1388,7 +1625,7 @@
   <w:comment w:id="0" w:author="Unknown Author" w:date="2026-04-06T23:02:56Z" w:initials="">
     <w:p>
       <w:pPr>
-        <w:overflowPunct w:val="false"/>
+        <w:overflowPunct w:val="true"/>
         <w:rPr/>
       </w:pPr>
       <w:r>
@@ -1410,7 +1647,7 @@
     </w:p>
     <w:p>
       <w:pPr>
-        <w:overflowPunct w:val="false"/>
+        <w:overflowPunct w:val="true"/>
         <w:rPr/>
       </w:pPr>
       <w:r>
@@ -1964,7 +2201,7 @@
     <w:pPr>
       <w:widowControl/>
       <w:suppressAutoHyphens w:val="true"/>
-      <w:overflowPunct w:val="true"/>
+      <w:overflowPunct w:val="false"/>
       <w:bidi w:val="0"/>
       <w:spacing w:before="0" w:after="0"/>
       <w:jc w:val="start"/>
@@ -2057,8 +2294,8 @@
       <w:iCs/>
     </w:rPr>
   </w:style>
-  <w:style w:type="character" w:styleId="Bullets">
-    <w:name w:val="Bullets"/>
+  <w:style w:type="character" w:styleId="Bulletsuser">
+    <w:name w:val="Bullets (user)"/>
     <w:qFormat/>
     <w:rPr>
       <w:rFonts w:ascii="OpenSymbol" w:hAnsi="OpenSymbol" w:eastAsia="OpenSymbol" w:cs="OpenSymbol"/>
@@ -2122,8 +2359,8 @@
       <w:rFonts w:cs="Noto Sans Devanagari"/>
     </w:rPr>
   </w:style>
-  <w:style w:type="paragraph" w:styleId="BlockQuotation">
-    <w:name w:val="Block Quotation"/>
+  <w:style w:type="paragraph" w:styleId="BlockQuotationuser">
+    <w:name w:val="Block Quotation (user)"/>
     <w:basedOn w:val="Normal"/>
     <w:qFormat/>
     <w:pPr>
@@ -2169,8 +2406,8 @@
       <w:szCs w:val="20"/>
     </w:rPr>
   </w:style>
-  <w:style w:type="paragraph" w:styleId="FrameContentsuser">
-    <w:name w:val="Frame Contents (user)"/>
+  <w:style w:type="paragraph" w:styleId="FrameContents">
+    <w:name w:val="Frame Contents"/>
     <w:basedOn w:val="Normal"/>
     <w:qFormat/>
     <w:pPr/>
@@ -2206,9 +2443,16 @@
     </w:pPr>
     <w:rPr/>
   </w:style>
-  <w:style w:type="paragraph" w:styleId="FrameContents">
-    <w:name w:val="Frame Contents"/>
+  <w:style w:type="paragraph" w:styleId="FrameContentsuser">
+    <w:name w:val="Frame Contents (user)"/>
     <w:basedOn w:val="Normal"/>
+    <w:qFormat/>
+    <w:pPr/>
+    <w:rPr/>
+  </w:style>
+  <w:style w:type="paragraph" w:styleId="Figure">
+    <w:name w:val="Figure"/>
+    <w:basedOn w:val="Caption"/>
     <w:qFormat/>
     <w:pPr/>
     <w:rPr/>

</xml_diff>